<commit_message>
Fix remaining font bug in Creative launch package doc (bullet lists, blockquote)
List Bullet and blockquote paragraphs reset Style/indent to Normal before
calling TypeParagraph(), which retroactively reverted the just-typed
paragraph back to Normal style/font - same root cause already fixed for
headings. Also caught List Bullet rendering at 12pt instead of the intended
11pt body size (the built-in List Bullet style carries its own font size).

Co-Authored-By: Claude Sonnet 5 <noreply@anthropic.com>
</commit_message>
<xml_diff>
--- a/creative-launch-package-proposal.docx
+++ b/creative-launch-package-proposal.docx
@@ -232,36 +232,77 @@
       </w:r>
     </w:p>
     <w:p>
-      <w:r>
+      <w:pPr>
+        <w:pStyle w:val="ListBullet"/>
+      </w:pPr>
+      <w:r>
+        <w:rPr>
+          <w:rFonts w:ascii="Calibri" w:hAnsi="Calibri" w:cs="Calibri"/>
+          <w:sz w:val="22"/>
+        </w:rPr>
         <w:t xml:space="preserve">Tagging is inconsistent across epics — some log every Creative asset as its own </w:t>
       </w:r>
       <w:r>
         <w:rPr>
+          <w:rFonts w:ascii="Calibri" w:hAnsi="Calibri" w:cs="Calibri"/>
           <w:i/>
+          <w:sz w:val="22"/>
         </w:rPr>
         <w:t>Marketing Creative Request</w:t>
       </w:r>
       <w:r>
+        <w:rPr>
+          <w:rFonts w:ascii="Calibri" w:hAnsi="Calibri" w:cs="Calibri"/>
+          <w:sz w:val="22"/>
+        </w:rPr>
         <w:t xml:space="preserve"> (AI Form Builder, Connectors &amp; Workflows), others bundle multiple creative outputs into one generic </w:t>
       </w:r>
       <w:r>
         <w:rPr>
+          <w:rFonts w:ascii="Calibri" w:hAnsi="Calibri" w:cs="Calibri"/>
           <w:i/>
+          <w:sz w:val="22"/>
         </w:rPr>
         <w:t>Task</w:t>
       </w:r>
       <w:r>
+        <w:rPr>
+          <w:rFonts w:ascii="Calibri" w:hAnsi="Calibri" w:cs="Calibri"/>
+          <w:sz w:val="22"/>
+        </w:rPr>
         <w:t xml:space="preserve"> (Auto-Schedule's "creative assets — social, email, newsletter, website, webinar, login page graphics" is one ticket covering six things), and a few epics don't break Creative's work out as separate issues at all (AAI Photo Insights, QB Intelligence Package). Where an epic shows zero Creative items, that most likely reflects logging habits, not that Creative genuinely did nothing — flagged per launch below.</w:t>
       </w:r>
     </w:p>
     <w:p>
-      <w:r>
-        <w:lastRenderedPageBreak/>
+      <w:pPr>
+        <w:pStyle w:val="ListBullet"/>
+      </w:pPr>
+      <w:r>
+        <w:rPr>
+          <w:rFonts w:ascii="Calibri" w:hAnsi="Calibri" w:cs="Calibri"/>
+          <w:sz w:val="22"/>
+        </w:rPr>
         <w:t>Only 3 of the 20 epics carry an explicit tier tag (T1: MKT-11523, MKT-12825; T2: MKT-11521, MKT-11522). The rest are inferred from asset volume and type, same caveat as the original analysis.</w:t>
       </w:r>
     </w:p>
-    <w:p/>
-    <w:p/>
+    <w:p>
+      <w:pPr>
+        <w:rPr>
+          <w:rFonts w:ascii="Calibri" w:hAnsi="Calibri" w:cs="Calibri"/>
+          <w:color w:val="363432"/>
+          <w:sz w:val="22"/>
+        </w:rPr>
+      </w:pPr>
+    </w:p>
+    <w:p>
+      <w:pPr>
+        <w:rPr>
+          <w:rFonts w:ascii="Calibri" w:hAnsi="Calibri" w:cs="Calibri"/>
+          <w:color w:val="363432"/>
+          <w:sz w:val="22"/>
+        </w:rPr>
+      </w:pPr>
+    </w:p>
     <w:p>
       <w:pPr>
         <w:pStyle w:val="Heading2"/>
@@ -899,7 +940,16 @@
           <w:color w:val="363432"/>
           <w:sz w:val="22"/>
         </w:rPr>
-        <w:t xml:space="preserve"> video and social/paid graphics are the backbone of what Creative gets asked for whenever they're involved in a launch at all — not sales collateral, which shows up less often and is always a light touch-up rather than new work. This is worth setting as the baseline expectation before the tier-specific breakdown below, which shows how far this bundle scales up (Tier 1), thins out (Tier 2), or disappears entirely (Tier 3).</w:t>
+        <w:t xml:space="preserve"> video and social/paid graphics are the backbone of what Creative gets asked for whenever they're involved in a launch at all — not sales collateral, which shows up less often and is always a light </w:t>
+      </w:r>
+      <w:r>
+        <w:rPr>
+          <w:rFonts w:ascii="Calibri" w:hAnsi="Calibri" w:cs="Calibri"/>
+          <w:color w:val="363432"/>
+          <w:sz w:val="22"/>
+        </w:rPr>
+        <w:lastRenderedPageBreak/>
+        <w:t>touch-up rather than new work. This is worth setting as the baseline expectation before the tier-specific breakdown below, which shows how far this bundle scales up (Tier 1), thins out (Tier 2), or disappears entirely (Tier 3).</w:t>
       </w:r>
     </w:p>
     <w:p>
@@ -1573,6 +1623,7 @@
           <w:color w:val="363432"/>
           <w:sz w:val="22"/>
         </w:rPr>
+        <w:lastRenderedPageBreak/>
         <w:t xml:space="preserve">Auto-Schedule's data point is a useful cross-check: rather than 8 separate tickets, it bundled the same scope into two multi-channel requests (Open Beta phase, GA phase) each covering "social, email, newsletter, website, webinar, login page graphics" — same actual workload, logged differently. Either logging pattern is fine; the point is the </w:t>
       </w:r>
       <w:r>
@@ -1959,34 +2010,34 @@
           <w:color w:val="363432"/>
           <w:sz w:val="22"/>
         </w:rPr>
+        <w:t>Evidence: MKT-12795 ("Tier 2 and 3" Pave epic, leanest data point in the whole dataset).</w:t>
+      </w:r>
+    </w:p>
+    <w:p>
+      <w:pPr>
+        <w:rPr>
+          <w:rFonts w:ascii="Calibri" w:hAnsi="Calibri" w:cs="Calibri"/>
+          <w:color w:val="363432"/>
+          <w:sz w:val="22"/>
+        </w:rPr>
+      </w:pPr>
+    </w:p>
+    <w:p>
+      <w:pPr>
+        <w:rPr>
+          <w:rFonts w:ascii="Calibri" w:hAnsi="Calibri" w:cs="Calibri"/>
+          <w:color w:val="363432"/>
+          <w:sz w:val="22"/>
+        </w:rPr>
+      </w:pPr>
+      <w:r>
+        <w:rPr>
+          <w:rFonts w:ascii="Calibri" w:hAnsi="Calibri" w:cs="Calibri"/>
+          <w:b/>
+          <w:color w:val="363432"/>
+          <w:sz w:val="22"/>
+        </w:rPr>
         <w:lastRenderedPageBreak/>
-        <w:t>Evidence: MKT-12795 ("Tier 2 and 3" Pave epic, leanest data point in the whole dataset).</w:t>
-      </w:r>
-    </w:p>
-    <w:p>
-      <w:pPr>
-        <w:rPr>
-          <w:rFonts w:ascii="Calibri" w:hAnsi="Calibri" w:cs="Calibri"/>
-          <w:color w:val="363432"/>
-          <w:sz w:val="22"/>
-        </w:rPr>
-      </w:pPr>
-    </w:p>
-    <w:p>
-      <w:pPr>
-        <w:rPr>
-          <w:rFonts w:ascii="Calibri" w:hAnsi="Calibri" w:cs="Calibri"/>
-          <w:color w:val="363432"/>
-          <w:sz w:val="22"/>
-        </w:rPr>
-      </w:pPr>
-      <w:r>
-        <w:rPr>
-          <w:rFonts w:ascii="Calibri" w:hAnsi="Calibri" w:cs="Calibri"/>
-          <w:b/>
-          <w:color w:val="363432"/>
-          <w:sz w:val="22"/>
-        </w:rPr>
         <w:t>Zero Creative items.</w:t>
       </w:r>
       <w:r>
@@ -2067,6 +2118,7 @@
     </w:p>
     <w:p>
       <w:pPr>
+        <w:ind w:left="720"/>
         <w:rPr>
           <w:rFonts w:ascii="Calibri" w:hAnsi="Calibri" w:cs="Calibri"/>
           <w:i/>
@@ -2088,7 +2140,6 @@
       <w:pPr>
         <w:rPr>
           <w:rFonts w:ascii="Calibri" w:hAnsi="Calibri" w:cs="Calibri"/>
-          <w:i/>
           <w:color w:val="363432"/>
           <w:sz w:val="22"/>
         </w:rPr>
@@ -2354,52 +2405,60 @@
                 <w:color w:val="363432"/>
                 <w:sz w:val="20"/>
               </w:rPr>
+              <w:t>MKT-12888 (FF AI Form Builder)</w:t>
+            </w:r>
+          </w:p>
+        </w:tc>
+        <w:tc>
+          <w:tcPr>
+            <w:tcW w:w="3120" w:type="dxa"/>
+          </w:tcPr>
+          <w:p>
+            <w:pPr>
+              <w:rPr>
+                <w:rFonts w:ascii="Calibri" w:hAnsi="Calibri" w:cs="Calibri"/>
+                <w:color w:val="363432"/>
+                <w:sz w:val="20"/>
+              </w:rPr>
+            </w:pPr>
+            <w:r>
+              <w:rPr>
+                <w:rFonts w:ascii="Calibri" w:hAnsi="Calibri" w:cs="Calibri"/>
+                <w:color w:val="363432"/>
+                <w:sz w:val="20"/>
+              </w:rPr>
+              <w:t>Tier 1</w:t>
+            </w:r>
+          </w:p>
+        </w:tc>
+        <w:tc>
+          <w:tcPr>
+            <w:tcW w:w="3120" w:type="dxa"/>
+          </w:tcPr>
+          <w:p>
+            <w:pPr>
+              <w:rPr>
+                <w:rFonts w:ascii="Calibri" w:hAnsi="Calibri" w:cs="Calibri"/>
+                <w:color w:val="363432"/>
+                <w:sz w:val="20"/>
+              </w:rPr>
+            </w:pPr>
+            <w:r>
+              <w:rPr>
+                <w:rFonts w:ascii="Calibri" w:hAnsi="Calibri" w:cs="Calibri"/>
+                <w:color w:val="363432"/>
+                <w:sz w:val="20"/>
+              </w:rPr>
+              <w:t xml:space="preserve">Brand style video, teaser video, social graphics, paid social ad creative, product imagery, Intercom banner creative, pitch deck update, </w:t>
+            </w:r>
+            <w:r>
+              <w:rPr>
+                <w:rFonts w:ascii="Calibri" w:hAnsi="Calibri" w:cs="Calibri"/>
+                <w:color w:val="363432"/>
+                <w:sz w:val="20"/>
+              </w:rPr>
               <w:lastRenderedPageBreak/>
-              <w:t>MKT-12888 (FF AI Form Builder)</w:t>
-            </w:r>
-          </w:p>
-        </w:tc>
-        <w:tc>
-          <w:tcPr>
-            <w:tcW w:w="3120" w:type="dxa"/>
-          </w:tcPr>
-          <w:p>
-            <w:pPr>
-              <w:rPr>
-                <w:rFonts w:ascii="Calibri" w:hAnsi="Calibri" w:cs="Calibri"/>
-                <w:color w:val="363432"/>
-                <w:sz w:val="20"/>
-              </w:rPr>
-            </w:pPr>
-            <w:r>
-              <w:rPr>
-                <w:rFonts w:ascii="Calibri" w:hAnsi="Calibri" w:cs="Calibri"/>
-                <w:color w:val="363432"/>
-                <w:sz w:val="20"/>
-              </w:rPr>
-              <w:t>Tier 1</w:t>
-            </w:r>
-          </w:p>
-        </w:tc>
-        <w:tc>
-          <w:tcPr>
-            <w:tcW w:w="3120" w:type="dxa"/>
-          </w:tcPr>
-          <w:p>
-            <w:pPr>
-              <w:rPr>
-                <w:rFonts w:ascii="Calibri" w:hAnsi="Calibri" w:cs="Calibri"/>
-                <w:color w:val="363432"/>
-                <w:sz w:val="20"/>
-              </w:rPr>
-            </w:pPr>
-            <w:r>
-              <w:rPr>
-                <w:rFonts w:ascii="Calibri" w:hAnsi="Calibri" w:cs="Calibri"/>
-                <w:color w:val="363432"/>
-                <w:sz w:val="20"/>
-              </w:rPr>
-              <w:t>Brand style video, teaser video, social graphics, paid social ad creative, product imagery, Intercom banner creative, pitch deck update, one-pager update (8 separate requests)</w:t>
+              <w:t>one-pager update (8 separate requests)</w:t>
             </w:r>
           </w:p>
         </w:tc>
@@ -2429,6 +2488,7 @@
                 <w:color w:val="363432"/>
                 <w:sz w:val="20"/>
               </w:rPr>
+              <w:lastRenderedPageBreak/>
               <w:t>MKT-12740 (Pave Connectors &amp; Workflows)</w:t>
             </w:r>
           </w:p>
@@ -3130,7 +3190,7 @@
   <w:abstractNum w:abstractNumId="0" w15:restartNumberingAfterBreak="0">
     <w:nsid w:val="FFFFFF89"/>
     <w:multiLevelType w:val="singleLevel"/>
-    <w:tmpl w:val="7FB83A94"/>
+    <w:tmpl w:val="B22A97D2"/>
     <w:lvl w:ilvl="0">
       <w:start w:val="1"/>
       <w:numFmt w:val="bullet"/>
@@ -3148,7 +3208,7 @@
       </w:rPr>
     </w:lvl>
   </w:abstractNum>
-  <w:num w:numId="1" w16cid:durableId="859272621">
+  <w:num w:numId="1" w16cid:durableId="273633260">
     <w:abstractNumId w:val="0"/>
   </w:num>
 </w:numbering>
@@ -3562,7 +3622,7 @@
     <w:link w:val="Heading1Char"/>
     <w:uiPriority w:val="9"/>
     <w:qFormat/>
-    <w:rsid w:val="00101A8B"/>
+    <w:rsid w:val="00437244"/>
     <w:pPr>
       <w:keepNext/>
       <w:keepLines/>
@@ -3584,7 +3644,7 @@
     <w:uiPriority w:val="9"/>
     <w:unhideWhenUsed/>
     <w:qFormat/>
-    <w:rsid w:val="00101A8B"/>
+    <w:rsid w:val="00437244"/>
     <w:pPr>
       <w:keepNext/>
       <w:keepLines/>
@@ -3607,7 +3667,7 @@
     <w:semiHidden/>
     <w:unhideWhenUsed/>
     <w:qFormat/>
-    <w:rsid w:val="00101A8B"/>
+    <w:rsid w:val="00437244"/>
     <w:pPr>
       <w:keepNext/>
       <w:keepLines/>
@@ -3630,7 +3690,7 @@
     <w:semiHidden/>
     <w:unhideWhenUsed/>
     <w:qFormat/>
-    <w:rsid w:val="00101A8B"/>
+    <w:rsid w:val="00437244"/>
     <w:pPr>
       <w:keepNext/>
       <w:keepLines/>
@@ -3653,7 +3713,7 @@
     <w:semiHidden/>
     <w:unhideWhenUsed/>
     <w:qFormat/>
-    <w:rsid w:val="00101A8B"/>
+    <w:rsid w:val="00437244"/>
     <w:pPr>
       <w:keepNext/>
       <w:keepLines/>
@@ -3674,7 +3734,7 @@
     <w:semiHidden/>
     <w:unhideWhenUsed/>
     <w:qFormat/>
-    <w:rsid w:val="00101A8B"/>
+    <w:rsid w:val="00437244"/>
     <w:pPr>
       <w:keepNext/>
       <w:keepLines/>
@@ -3697,7 +3757,7 @@
     <w:semiHidden/>
     <w:unhideWhenUsed/>
     <w:qFormat/>
-    <w:rsid w:val="00101A8B"/>
+    <w:rsid w:val="00437244"/>
     <w:pPr>
       <w:keepNext/>
       <w:keepLines/>
@@ -3718,7 +3778,7 @@
     <w:semiHidden/>
     <w:unhideWhenUsed/>
     <w:qFormat/>
-    <w:rsid w:val="00101A8B"/>
+    <w:rsid w:val="00437244"/>
     <w:pPr>
       <w:keepNext/>
       <w:keepLines/>
@@ -3741,7 +3801,7 @@
     <w:semiHidden/>
     <w:unhideWhenUsed/>
     <w:qFormat/>
-    <w:rsid w:val="00101A8B"/>
+    <w:rsid w:val="00437244"/>
     <w:pPr>
       <w:keepNext/>
       <w:keepLines/>
@@ -3785,7 +3845,7 @@
     <w:basedOn w:val="DefaultParagraphFont"/>
     <w:link w:val="Heading1"/>
     <w:uiPriority w:val="9"/>
-    <w:rsid w:val="00101A8B"/>
+    <w:rsid w:val="00437244"/>
     <w:rPr>
       <w:rFonts w:asciiTheme="majorHAnsi" w:eastAsiaTheme="majorEastAsia" w:hAnsiTheme="majorHAnsi" w:cstheme="majorBidi"/>
       <w:color w:val="0F4761" w:themeColor="accent1" w:themeShade="BF"/>
@@ -3798,7 +3858,7 @@
     <w:basedOn w:val="DefaultParagraphFont"/>
     <w:link w:val="Heading2"/>
     <w:uiPriority w:val="9"/>
-    <w:rsid w:val="00101A8B"/>
+    <w:rsid w:val="00437244"/>
     <w:rPr>
       <w:rFonts w:asciiTheme="majorHAnsi" w:eastAsiaTheme="majorEastAsia" w:hAnsiTheme="majorHAnsi" w:cstheme="majorBidi"/>
       <w:color w:val="0F4761" w:themeColor="accent1" w:themeShade="BF"/>
@@ -3812,7 +3872,7 @@
     <w:link w:val="Heading3"/>
     <w:uiPriority w:val="9"/>
     <w:semiHidden/>
-    <w:rsid w:val="00101A8B"/>
+    <w:rsid w:val="00437244"/>
     <w:rPr>
       <w:rFonts w:eastAsiaTheme="majorEastAsia" w:cstheme="majorBidi"/>
       <w:color w:val="0F4761" w:themeColor="accent1" w:themeShade="BF"/>
@@ -3826,7 +3886,7 @@
     <w:link w:val="Heading4"/>
     <w:uiPriority w:val="9"/>
     <w:semiHidden/>
-    <w:rsid w:val="00101A8B"/>
+    <w:rsid w:val="00437244"/>
     <w:rPr>
       <w:rFonts w:eastAsiaTheme="majorEastAsia" w:cstheme="majorBidi"/>
       <w:i/>
@@ -3840,7 +3900,7 @@
     <w:link w:val="Heading5"/>
     <w:uiPriority w:val="9"/>
     <w:semiHidden/>
-    <w:rsid w:val="00101A8B"/>
+    <w:rsid w:val="00437244"/>
     <w:rPr>
       <w:rFonts w:eastAsiaTheme="majorEastAsia" w:cstheme="majorBidi"/>
       <w:color w:val="0F4761" w:themeColor="accent1" w:themeShade="BF"/>
@@ -3852,7 +3912,7 @@
     <w:link w:val="Heading6"/>
     <w:uiPriority w:val="9"/>
     <w:semiHidden/>
-    <w:rsid w:val="00101A8B"/>
+    <w:rsid w:val="00437244"/>
     <w:rPr>
       <w:rFonts w:eastAsiaTheme="majorEastAsia" w:cstheme="majorBidi"/>
       <w:i/>
@@ -3866,7 +3926,7 @@
     <w:link w:val="Heading7"/>
     <w:uiPriority w:val="9"/>
     <w:semiHidden/>
-    <w:rsid w:val="00101A8B"/>
+    <w:rsid w:val="00437244"/>
     <w:rPr>
       <w:rFonts w:eastAsiaTheme="majorEastAsia" w:cstheme="majorBidi"/>
       <w:color w:val="595959" w:themeColor="text1" w:themeTint="A6"/>
@@ -3878,7 +3938,7 @@
     <w:link w:val="Heading8"/>
     <w:uiPriority w:val="9"/>
     <w:semiHidden/>
-    <w:rsid w:val="00101A8B"/>
+    <w:rsid w:val="00437244"/>
     <w:rPr>
       <w:rFonts w:eastAsiaTheme="majorEastAsia" w:cstheme="majorBidi"/>
       <w:i/>
@@ -3892,7 +3952,7 @@
     <w:link w:val="Heading9"/>
     <w:uiPriority w:val="9"/>
     <w:semiHidden/>
-    <w:rsid w:val="00101A8B"/>
+    <w:rsid w:val="00437244"/>
     <w:rPr>
       <w:rFonts w:eastAsiaTheme="majorEastAsia" w:cstheme="majorBidi"/>
       <w:color w:val="272727" w:themeColor="text1" w:themeTint="D8"/>
@@ -3905,7 +3965,7 @@
     <w:link w:val="TitleChar"/>
     <w:uiPriority w:val="10"/>
     <w:qFormat/>
-    <w:rsid w:val="00101A8B"/>
+    <w:rsid w:val="00437244"/>
     <w:pPr>
       <w:spacing w:after="80" w:line="240" w:lineRule="auto"/>
       <w:contextualSpacing/>
@@ -3923,7 +3983,7 @@
     <w:basedOn w:val="DefaultParagraphFont"/>
     <w:link w:val="Title"/>
     <w:uiPriority w:val="10"/>
-    <w:rsid w:val="00101A8B"/>
+    <w:rsid w:val="00437244"/>
     <w:rPr>
       <w:rFonts w:asciiTheme="majorHAnsi" w:eastAsiaTheme="majorEastAsia" w:hAnsiTheme="majorHAnsi" w:cstheme="majorBidi"/>
       <w:spacing w:val="-10"/>
@@ -3939,7 +3999,7 @@
     <w:link w:val="SubtitleChar"/>
     <w:uiPriority w:val="11"/>
     <w:qFormat/>
-    <w:rsid w:val="00101A8B"/>
+    <w:rsid w:val="00437244"/>
     <w:pPr>
       <w:numPr>
         <w:ilvl w:val="1"/>
@@ -3958,7 +4018,7 @@
     <w:basedOn w:val="DefaultParagraphFont"/>
     <w:link w:val="Subtitle"/>
     <w:uiPriority w:val="11"/>
-    <w:rsid w:val="00101A8B"/>
+    <w:rsid w:val="00437244"/>
     <w:rPr>
       <w:rFonts w:eastAsiaTheme="majorEastAsia" w:cstheme="majorBidi"/>
       <w:color w:val="595959" w:themeColor="text1" w:themeTint="A6"/>
@@ -3974,7 +4034,7 @@
     <w:link w:val="QuoteChar"/>
     <w:uiPriority w:val="29"/>
     <w:qFormat/>
-    <w:rsid w:val="00101A8B"/>
+    <w:rsid w:val="00437244"/>
     <w:pPr>
       <w:spacing w:before="160"/>
       <w:jc w:val="center"/>
@@ -3990,7 +4050,7 @@
     <w:basedOn w:val="DefaultParagraphFont"/>
     <w:link w:val="Quote"/>
     <w:uiPriority w:val="29"/>
-    <w:rsid w:val="00101A8B"/>
+    <w:rsid w:val="00437244"/>
     <w:rPr>
       <w:i/>
       <w:iCs/>
@@ -4002,7 +4062,7 @@
     <w:basedOn w:val="Normal"/>
     <w:uiPriority w:val="34"/>
     <w:qFormat/>
-    <w:rsid w:val="00101A8B"/>
+    <w:rsid w:val="00437244"/>
     <w:pPr>
       <w:ind w:left="720"/>
       <w:contextualSpacing/>
@@ -4013,7 +4073,7 @@
     <w:basedOn w:val="DefaultParagraphFont"/>
     <w:uiPriority w:val="21"/>
     <w:qFormat/>
-    <w:rsid w:val="00101A8B"/>
+    <w:rsid w:val="00437244"/>
     <w:rPr>
       <w:i/>
       <w:iCs/>
@@ -4027,7 +4087,7 @@
     <w:link w:val="IntenseQuoteChar"/>
     <w:uiPriority w:val="30"/>
     <w:qFormat/>
-    <w:rsid w:val="00101A8B"/>
+    <w:rsid w:val="00437244"/>
     <w:pPr>
       <w:pBdr>
         <w:top w:val="single" w:sz="4" w:space="10" w:color="0F4761" w:themeColor="accent1" w:themeShade="BF"/>
@@ -4048,7 +4108,7 @@
     <w:basedOn w:val="DefaultParagraphFont"/>
     <w:link w:val="IntenseQuote"/>
     <w:uiPriority w:val="30"/>
-    <w:rsid w:val="00101A8B"/>
+    <w:rsid w:val="00437244"/>
     <w:rPr>
       <w:i/>
       <w:iCs/>
@@ -4060,7 +4120,7 @@
     <w:basedOn w:val="DefaultParagraphFont"/>
     <w:uiPriority w:val="32"/>
     <w:qFormat/>
-    <w:rsid w:val="00101A8B"/>
+    <w:rsid w:val="00437244"/>
     <w:rPr>
       <w:b/>
       <w:bCs/>
@@ -4074,7 +4134,7 @@
     <w:basedOn w:val="Normal"/>
     <w:uiPriority w:val="99"/>
     <w:unhideWhenUsed/>
-    <w:rsid w:val="00101A8B"/>
+    <w:rsid w:val="00437244"/>
     <w:pPr>
       <w:numPr>
         <w:numId w:val="1"/>

</xml_diff>